<commit_message>
New: Compras e ajustes para equipamentos Internos
</commit_message>
<xml_diff>
--- a/models/ChecklistSeparacaoEquipamentos.docx
+++ b/models/ChecklistSeparacaoEquipamentos.docx
@@ -251,7 +251,7 @@
         </w:pBdr>
       </w:pPr>
       <w:r>
-        <w:t xml:space="preserve"> </w:t>
+        <w:t>{%p for nota in notasgerais %}</w:t>
       </w:r>
     </w:p>
     <w:p>
@@ -261,7 +261,7 @@
         </w:pBdr>
       </w:pPr>
       <w:r>
-        <w:t xml:space="preserve"> </w:t>
+        <w:t>{{ nota }}</w:t>
       </w:r>
     </w:p>
     <w:p>
@@ -271,7 +271,7 @@
         </w:pBdr>
       </w:pPr>
       <w:r>
-        <w:t xml:space="preserve"> </w:t>
+        <w:t>{%p endfor %}</w:t>
       </w:r>
     </w:p>
     <w:p>

</xml_diff>